<commit_message>
Refactor backend into flat modules; refresh dataset, docs and Claude tooling
- Flatten backend/app into one module per concern (loaders, ingest, search,
  answer, guardrails, feedback, metrics, evals, api, db, llm, rules, schemas)
- Dataset quality pass: 24 meetings + 16 OOXML docs, re-dated to 2026
  (user-approved); golden eval set updated to match
- Docs: TECH.md, CODE_REVIEW.md, rewritten MEASUREMENT.md, stale paths and
  dates fixed in TASKS.md / backend README, refreshed project-status memory
- Claude Code: ruff PostToolUse hook and /verify project skill

Co-Authored-By: Claude Opus 5.5 <noreply@anthropic.com>
</commit_message>
<xml_diff>
--- a/data/documents/docx/corrective_action_8d.docx
+++ b/data/documents/docx/corrective_action_8d.docx
@@ -50,7 +50,7 @@
           <w:b w:val="0"/>
           <w:i w:val="0"/>
         </w:rPr>
-        <w:t xml:space="preserve"> CAR-2024-ND01</w:t>
+        <w:t xml:space="preserve"> CAR-2026-ND01</w:t>
       </w:r>
     </w:p>
     <w:p>
@@ -69,7 +69,7 @@
           <w:b w:val="0"/>
           <w:i w:val="0"/>
         </w:rPr>
-        <w:t xml:space="preserve"> 8D-2024-004</w:t>
+        <w:t xml:space="preserve"> 8D-2026-004</w:t>
       </w:r>
     </w:p>
     <w:p>
@@ -88,7 +88,7 @@
           <w:b w:val="0"/>
           <w:i w:val="0"/>
         </w:rPr>
-        <w:t xml:space="preserve"> March 18, 2024 | </w:t>
+        <w:t xml:space="preserve"> March 16, 2026 | </w:t>
       </w:r>
       <w:r>
         <w:rPr>
@@ -102,7 +102,7 @@
           <w:b w:val="0"/>
           <w:i w:val="0"/>
         </w:rPr>
-        <w:t xml:space="preserve"> April 30, 2024</w:t>
+        <w:t xml:space="preserve"> June 4, 2026</w:t>
       </w:r>
     </w:p>
     <w:p>
@@ -176,7 +176,7 @@
           <w:b w:val="0"/>
           <w:i w:val="0"/>
         </w:rPr>
-        <w:t>FastChip Semiconductor assembled an emergency cross-functional task force on March 12, 2024, immediately following the electrical failure of qualification units:</w:t>
+        <w:t>FastChip Semiconductor assembled an emergency cross-functional task force on March 10, 2026, immediately following the electrical failure of qualification units:</w:t>
       </w:r>
     </w:p>
     <w:p>
@@ -345,7 +345,7 @@
           <w:b w:val="0"/>
           <w:i w:val="0"/>
         </w:rPr>
-        <w:t>During AEC-Q100 Grade 1 qualification testing of the Volta-7 automotive powertrain controller (Rev A silicon, package QFN-48), 3 out of 231 units failed functional and parametric screening at the intermediate 500-hour HTOL stress readout (Chamber TA = 125°C, TJ = 150°C, VDD = 1.15V, VDDIO = 5.25V). AEC-Q100 qualification standards require zero failures (0/231, C=0 criteria). The failing devices (U042, U089, U115 from Lot LOT-V7-008) exhibited resistive short circuits to ground on Pin 14 (CAN-FD TX) and excessive leakage on Pin 22 (LIN Bus IO), rendering the devices completely non-functional.</w:t>
+        <w:t>During AEC-Q100 Grade 1 qualification testing of the Volta-7 automotive powertrain controller (Rev A silicon, package QFN-48), 3 out of 231 units failed functional and parametric screening at the intermediate 500-hour HTOL stress readout (Chamber TA = 125°C, TJ = 150°C, VDD = 1.15V, VDDIO = 5.25V). AEC-Q100 qualification standards require zero failures (0/231, C=0 criteria). The failing devices (U162, U189, U215 from Lot LOT-V7-005) exhibited resistive short circuits to ground on Pin 14 (CAN-FD TX) and excessive leakage on Pin 22 (LIN Bus IO), rendering the devices completely non-functional.</w:t>
       </w:r>
     </w:p>
     <w:p>
@@ -375,7 +375,7 @@
           <w:b w:val="0"/>
           <w:i w:val="0"/>
         </w:rPr>
-        <w:t xml:space="preserve"> Implemented immediate internal shipping halt on all Volta-7 Rev A silicon from Austin warehouse and Penang distribution hub on March 12, 2024.</w:t>
+        <w:t xml:space="preserve"> Implemented immediate internal shipping halt on all Volta-7 Rev A silicon from Austin warehouse and Penang distribution hub on March 10, 2026.</w:t>
       </w:r>
     </w:p>
     <w:p>
@@ -397,7 +397,7 @@
           <w:b w:val="0"/>
           <w:i w:val="0"/>
         </w:rPr>
-        <w:t xml:space="preserve"> Contacted NovaDrive Motors (Tom Harris) on March 18, 2024, to formally issue a safety advisory regarding the 50 ES1 engineering samples delivered on March 1. NovaDrive quarantined all remaining unmounted units and restricted evaluation to bench-top ambient testing only.</w:t>
+        <w:t xml:space="preserve"> Contacted NovaDrive Motors (Tom Harris) on March 16, 2026, to formally issue a safety advisory regarding the 50 ES1 engineering samples delivered on February 27. NovaDrive quarantined all remaining unmounted units and restricted evaluation to bench-top ambient testing only.</w:t>
       </w:r>
     </w:p>
     <w:p>
@@ -436,7 +436,7 @@
           <w:b w:val="0"/>
           <w:i w:val="0"/>
         </w:rPr>
-        <w:t>Physical failure analysis conducted by Rosa Santos (FA Report FA-2024-0314) identified gate dielectric breakdown and localized silicon melting in the primary ESD rail clamp transistor of the IO pad ring. The team performed a 5-Why root cause analysis:</w:t>
+        <w:t>Physical failure analysis conducted by Rosa Santos (FA Report FA-2026-0312) identified gate dielectric breakdown and localized silicon melting in the primary ESD rail clamp transistor of the IO pad ring. The team performed a 5-Why root cause analysis:</w:t>
       </w:r>
     </w:p>
     <w:p>
@@ -638,7 +638,7 @@
           <w:b w:val="0"/>
           <w:i w:val="0"/>
         </w:rPr>
-        <w:t xml:space="preserve"> cell (280 µm width, 16 fingers, integrated ballast resistance) across all high-voltage transceivers. Tape-out committed on March 23, 2024 (4 metal masks).</w:t>
+        <w:t xml:space="preserve"> cell (280 µm width, 16 fingers, integrated ballast resistance) across all high-voltage transceivers. Tape-out committed on March 21, 2026 (4 masks: Contact, Metal 1, Via 1, Metal 2).</w:t>
       </w:r>
     </w:p>
     <w:p>
@@ -712,7 +712,7 @@
           <w:b w:val="0"/>
           <w:i w:val="0"/>
         </w:rPr>
-        <w:t xml:space="preserve"> FastChip Penang Fab expedited 5 hot-lots of Rev B silicon (Lots LOT-V7-020 through LOT-V7-024), completing wafer sort on April 21, 2024, with outstanding yield of 78.4%.</w:t>
+        <w:t xml:space="preserve"> FastChip Penang Fab expedited 5 hot-lots of Rev B silicon (Lots LOT-V7-020 through LOT-V7-024), completing wafer sort on April 19, 2026, with outstanding yield of 78.4%.</w:t>
       </w:r>
     </w:p>
     <w:p>
@@ -734,7 +734,7 @@
           <w:b w:val="0"/>
           <w:i w:val="0"/>
         </w:rPr>
-        <w:t xml:space="preserve"> Kevin Tran subjected 231 units of Rev B silicon (Lot LOT-V7-020) to accelerated HTOL, 1000-cycle Temperature Cycling (-55°C to +150°C), and 96-hour HAST testing.</w:t>
+        <w:t xml:space="preserve"> Kevin Tran ran early-life burn-in (ELFR, 800 units), 96-hour HAST, 1000-cycle Temperature Cycling (-55°C to +150°C) and the full 1000-hour HTOL on 231 units of Rev B silicon (Lot LOT-V7-020), starting April 21, 2026.</w:t>
       </w:r>
     </w:p>
     <w:p>
@@ -742,35 +742,31 @@
         <w:ind w:left="432" w:hanging="360"/>
       </w:pPr>
       <w:r>
-        <w:t xml:space="preserve">3. </w:t>
+        <w:t>3. Validation Result: Interim ELFR and HAST results went to NovaDrive on April 28, 2026; the final 1000-hour HTOL readout on June 2, 2026 showed zero failures (0/231). Tri-temp ATE electrical screening demonstrated zero parametric drift on Pin 14 and Pin 22 leakage (&lt;10 nA measured vs 1.0 µA limit). D6 validation successfully closed.</w:t>
       </w:r>
       <w:r>
         <w:rPr>
           <w:b/>
           <w:i w:val="0"/>
         </w:rPr>
-        <w:t>Validation Result:</w:t>
       </w:r>
       <w:r>
         <w:rPr>
           <w:b w:val="0"/>
           <w:i w:val="0"/>
         </w:rPr>
-        <w:t xml:space="preserve"> Electrical screening completed on April 28, 2024. </w:t>
       </w:r>
       <w:r>
         <w:rPr>
           <w:b/>
           <w:i w:val="0"/>
         </w:rPr>
-        <w:t>Zero failures (0/231) observed.</w:t>
       </w:r>
       <w:r>
         <w:rPr>
           <w:b w:val="0"/>
           <w:i w:val="0"/>
         </w:rPr>
-        <w:t xml:space="preserve"> Tri-temp ATE electrical screening demonstrated zero parametric drift on Pin 14 and Pin 22 leakage (&lt;10 nA measured vs 1.0 µA limit). D6 validation successfully closed.</w:t>
       </w:r>
     </w:p>
     <w:p>

</xml_diff>